<commit_message>
Backend finalisation + major improvements
ADDED:
Firebase functions (automated points earning; scheduled monthly)

CHANGED:
Finalized migration to backend
Changed errors to setState
Changed obsolete withOpacity to withValues(alpha:

REMOVED:
Removed persistence service (Obsolete)
Hardcoded data
Redundant "Edit budget" in budget page
Redundant history_page.dart

TODO:
Match (scholarships) page
</commit_message>
<xml_diff>
--- a/docs/MMP&MVPUserStories.docx
+++ b/docs/MMP&MVPUserStories.docx
@@ -299,6 +299,30 @@
           <w:lang w:val="en-US"/>
         </w:rPr>
         <w:t>As a student, I want to see a progress tracker of how close I am to acquiring a scholarship based on the points I currently have.</w:t>
+      </w:r>
+    </w:p>
+    <w:p>
+      <w:pPr>
+        <w:pStyle w:val="ListParagraph"/>
+        <w:numPr>
+          <w:ilvl w:val="0"/>
+          <w:numId w:val="2"/>
+        </w:numPr>
+        <w:rPr>
+          <w:lang w:val="en-US"/>
+        </w:rPr>
+      </w:pPr>
+      <w:r>
+        <w:rPr>
+          <w:lang w:val="en-US"/>
+        </w:rPr>
+        <w:t xml:space="preserve">As an international student, I </w:t>
+      </w:r>
+      <w:r>
+        <w:rPr>
+          <w:lang w:val="en-US"/>
+        </w:rPr>
+        <w:t>want to set different currencies in the application.</w:t>
       </w:r>
     </w:p>
     <w:sectPr>
@@ -1770,9 +1794,12 @@
 </file>
 
 <file path=customXml/item1.xml><?xml version="1.0" encoding="utf-8"?>
-<p:properties xmlns:p="http://schemas.microsoft.com/office/2006/metadata/properties" xmlns:xsi="http://www.w3.org/2001/XMLSchema-instance" xmlns:pc="http://schemas.microsoft.com/office/infopath/2007/PartnerControls">
-  <documentManagement/>
-</p:properties>
+<?mso-contentType ?>
+<FormTemplates xmlns="http://schemas.microsoft.com/sharepoint/v3/contenttype/forms">
+  <Display>DocumentLibraryForm</Display>
+  <Edit>DocumentLibraryForm</Edit>
+  <New>DocumentLibraryForm</New>
+</FormTemplates>
 </file>
 
 <file path=customXml/item2.xml><?xml version="1.0" encoding="utf-8"?>
@@ -1920,19 +1947,15 @@
 </file>
 
 <file path=customXml/item3.xml><?xml version="1.0" encoding="utf-8"?>
-<?mso-contentType ?>
-<FormTemplates xmlns="http://schemas.microsoft.com/sharepoint/v3/contenttype/forms">
-  <Display>DocumentLibraryForm</Display>
-  <Edit>DocumentLibraryForm</Edit>
-  <New>DocumentLibraryForm</New>
-</FormTemplates>
+<p:properties xmlns:p="http://schemas.microsoft.com/office/2006/metadata/properties" xmlns:xsi="http://www.w3.org/2001/XMLSchema-instance" xmlns:pc="http://schemas.microsoft.com/office/infopath/2007/PartnerControls">
+  <documentManagement/>
+</p:properties>
 </file>
 
 <file path=customXml/itemProps1.xml><?xml version="1.0" encoding="utf-8"?>
-<ds:datastoreItem xmlns:ds="http://schemas.openxmlformats.org/officeDocument/2006/customXml" ds:itemID="{AE772A8B-AC0E-4839-86EF-E6927A4B6226}">
+<ds:datastoreItem xmlns:ds="http://schemas.openxmlformats.org/officeDocument/2006/customXml" ds:itemID="{A804FF75-88C5-4744-89EF-6B49C8777E78}">
   <ds:schemaRefs>
-    <ds:schemaRef ds:uri="http://schemas.microsoft.com/office/2006/metadata/properties"/>
-    <ds:schemaRef ds:uri="http://schemas.microsoft.com/office/infopath/2007/PartnerControls"/>
+    <ds:schemaRef ds:uri="http://schemas.microsoft.com/sharepoint/v3/contenttype/forms"/>
   </ds:schemaRefs>
 </ds:datastoreItem>
 </file>
@@ -1956,9 +1979,10 @@
 </file>
 
 <file path=customXml/itemProps3.xml><?xml version="1.0" encoding="utf-8"?>
-<ds:datastoreItem xmlns:ds="http://schemas.openxmlformats.org/officeDocument/2006/customXml" ds:itemID="{A804FF75-88C5-4744-89EF-6B49C8777E78}">
+<ds:datastoreItem xmlns:ds="http://schemas.openxmlformats.org/officeDocument/2006/customXml" ds:itemID="{AE772A8B-AC0E-4839-86EF-E6927A4B6226}">
   <ds:schemaRefs>
-    <ds:schemaRef ds:uri="http://schemas.microsoft.com/sharepoint/v3/contenttype/forms"/>
+    <ds:schemaRef ds:uri="http://schemas.microsoft.com/office/2006/metadata/properties"/>
+    <ds:schemaRef ds:uri="http://schemas.microsoft.com/office/infopath/2007/PartnerControls"/>
   </ds:schemaRefs>
 </ds:datastoreItem>
 </file>
</xml_diff>

<commit_message>
update MMP user stories
</commit_message>
<xml_diff>
--- a/docs/MMP&MVPUserStories.docx
+++ b/docs/MMP&MVPUserStories.docx
@@ -262,31 +262,109 @@
         <w:rPr>
           <w:lang w:val="en-US"/>
         </w:rPr>
-        <w:t>As a student, I want extra security</w:t>
-      </w:r>
-      <w:r>
-        <w:rPr>
-          <w:lang w:val="en-US"/>
-        </w:rPr>
-        <w:t xml:space="preserve">, </w:t>
-      </w:r>
-      <w:r>
-        <w:rPr>
-          <w:lang w:val="en-US"/>
-        </w:rPr>
-        <w:t xml:space="preserve">such as </w:t>
-      </w:r>
-      <w:r>
-        <w:rPr>
-          <w:lang w:val="en-US"/>
-        </w:rPr>
-        <w:t>M</w:t>
-      </w:r>
-      <w:r>
-        <w:rPr>
-          <w:lang w:val="en-US"/>
-        </w:rPr>
-        <w:t>FA, so my financial data remains secure.</w:t>
+        <w:t>As a student, I want to be able to create an account using my mobile number instead of my email address.</w:t>
+      </w:r>
+    </w:p>
+    <w:p>
+      <w:pPr>
+        <w:pStyle w:val="ListParagraph"/>
+        <w:numPr>
+          <w:ilvl w:val="0"/>
+          <w:numId w:val="1"/>
+        </w:numPr>
+        <w:rPr>
+          <w:lang w:val="en-US"/>
+        </w:rPr>
+      </w:pPr>
+      <w:r>
+        <w:rPr>
+          <w:lang w:val="en-US"/>
+        </w:rPr>
+        <w:t>As a student, I want extra security, such as MFA, so my financial data remains secure.</w:t>
+      </w:r>
+      <w:r>
+        <w:rPr>
+          <w:lang w:val="en-US"/>
+        </w:rPr>
+        <w:t xml:space="preserve"> I would like to receive </w:t>
+      </w:r>
+      <w:r>
+        <w:rPr>
+          <w:lang w:val="en-US"/>
+        </w:rPr>
+        <w:t>code</w:t>
+      </w:r>
+      <w:r>
+        <w:rPr>
+          <w:lang w:val="en-US"/>
+        </w:rPr>
+        <w:t xml:space="preserve"> through mail or SMS</w:t>
+      </w:r>
+      <w:r>
+        <w:rPr>
+          <w:lang w:val="en-US"/>
+        </w:rPr>
+        <w:t xml:space="preserve"> when I want to register or </w:t>
+      </w:r>
+      <w:r>
+        <w:rPr>
+          <w:lang w:val="en-US"/>
+        </w:rPr>
+        <w:t>login or</w:t>
+      </w:r>
+      <w:r>
+        <w:rPr>
+          <w:lang w:val="en-US"/>
+        </w:rPr>
+        <w:t xml:space="preserve"> perform secure operations such as changing my password</w:t>
+      </w:r>
+      <w:r>
+        <w:rPr>
+          <w:lang w:val="en-US"/>
+        </w:rPr>
+        <w:t>.</w:t>
+      </w:r>
+    </w:p>
+    <w:p>
+      <w:pPr>
+        <w:pStyle w:val="ListParagraph"/>
+        <w:numPr>
+          <w:ilvl w:val="0"/>
+          <w:numId w:val="1"/>
+        </w:numPr>
+        <w:rPr>
+          <w:lang w:val="en-US"/>
+        </w:rPr>
+      </w:pPr>
+      <w:r>
+        <w:rPr>
+          <w:lang w:val="en-US"/>
+        </w:rPr>
+        <w:t>I would like to be able to reset my password if I</w:t>
+      </w:r>
+      <w:r>
+        <w:rPr>
+          <w:lang w:val="en-US"/>
+        </w:rPr>
+        <w:t>’ve</w:t>
+      </w:r>
+      <w:r>
+        <w:rPr>
+          <w:lang w:val="en-US"/>
+        </w:rPr>
+        <w:t xml:space="preserve"> forgot</w:t>
+      </w:r>
+      <w:r>
+        <w:rPr>
+          <w:lang w:val="en-US"/>
+        </w:rPr>
+        <w:t>ten</w:t>
+      </w:r>
+      <w:r>
+        <w:rPr>
+          <w:lang w:val="en-US"/>
+        </w:rPr>
+        <w:t xml:space="preserve"> it. </w:t>
       </w:r>
     </w:p>
     <w:p>
@@ -1938,9 +2016,12 @@
 </file>
 
 <file path=customXml/item1.xml><?xml version="1.0" encoding="utf-8"?>
-<p:properties xmlns:p="http://schemas.microsoft.com/office/2006/metadata/properties" xmlns:xsi="http://www.w3.org/2001/XMLSchema-instance" xmlns:pc="http://schemas.microsoft.com/office/infopath/2007/PartnerControls">
-  <documentManagement/>
-</p:properties>
+<?mso-contentType ?>
+<FormTemplates xmlns="http://schemas.microsoft.com/sharepoint/v3/contenttype/forms">
+  <Display>DocumentLibraryForm</Display>
+  <Edit>DocumentLibraryForm</Edit>
+  <New>DocumentLibraryForm</New>
+</FormTemplates>
 </file>
 
 <file path=customXml/item2.xml><?xml version="1.0" encoding="utf-8"?>
@@ -2088,19 +2169,15 @@
 </file>
 
 <file path=customXml/item3.xml><?xml version="1.0" encoding="utf-8"?>
-<?mso-contentType ?>
-<FormTemplates xmlns="http://schemas.microsoft.com/sharepoint/v3/contenttype/forms">
-  <Display>DocumentLibraryForm</Display>
-  <Edit>DocumentLibraryForm</Edit>
-  <New>DocumentLibraryForm</New>
-</FormTemplates>
+<p:properties xmlns:p="http://schemas.microsoft.com/office/2006/metadata/properties" xmlns:xsi="http://www.w3.org/2001/XMLSchema-instance" xmlns:pc="http://schemas.microsoft.com/office/infopath/2007/PartnerControls">
+  <documentManagement/>
+</p:properties>
 </file>
 
 <file path=customXml/itemProps1.xml><?xml version="1.0" encoding="utf-8"?>
-<ds:datastoreItem xmlns:ds="http://schemas.openxmlformats.org/officeDocument/2006/customXml" ds:itemID="{AE772A8B-AC0E-4839-86EF-E6927A4B6226}">
+<ds:datastoreItem xmlns:ds="http://schemas.openxmlformats.org/officeDocument/2006/customXml" ds:itemID="{A804FF75-88C5-4744-89EF-6B49C8777E78}">
   <ds:schemaRefs>
-    <ds:schemaRef ds:uri="http://schemas.microsoft.com/office/2006/metadata/properties"/>
-    <ds:schemaRef ds:uri="http://schemas.microsoft.com/office/infopath/2007/PartnerControls"/>
+    <ds:schemaRef ds:uri="http://schemas.microsoft.com/sharepoint/v3/contenttype/forms"/>
   </ds:schemaRefs>
 </ds:datastoreItem>
 </file>
@@ -2124,9 +2201,10 @@
 </file>
 
 <file path=customXml/itemProps3.xml><?xml version="1.0" encoding="utf-8"?>
-<ds:datastoreItem xmlns:ds="http://schemas.openxmlformats.org/officeDocument/2006/customXml" ds:itemID="{A804FF75-88C5-4744-89EF-6B49C8777E78}">
+<ds:datastoreItem xmlns:ds="http://schemas.openxmlformats.org/officeDocument/2006/customXml" ds:itemID="{AE772A8B-AC0E-4839-86EF-E6927A4B6226}">
   <ds:schemaRefs>
-    <ds:schemaRef ds:uri="http://schemas.microsoft.com/sharepoint/v3/contenttype/forms"/>
+    <ds:schemaRef ds:uri="http://schemas.microsoft.com/office/2006/metadata/properties"/>
+    <ds:schemaRef ds:uri="http://schemas.microsoft.com/office/infopath/2007/PartnerControls"/>
   </ds:schemaRefs>
 </ds:datastoreItem>
 </file>
</xml_diff>